<commit_message>
Update Government Savings Automation Assessment documents and add new deliverables
- Revised the Government Savings Coverage Matrix and related assessment documents to reflect updated metrics and findings.
- Enhanced the Government Savings Automation Coverage Assessment with detailed coverage summaries and executive findings.
- Introduced new Python scripts for generating assessment deliverables, including charts and reports for leadership updates.
- Added a bi-weekly leadership update document outlining recent progress and metrics for V2 and V3 automation efforts.

These changes aim to improve documentation accuracy and provide comprehensive insights into automation coverage and performance metrics.
</commit_message>
<xml_diff>
--- a/government-savings-automation-assessment/04-leadership/Government-Savings-Automation-Assessment-Review-Findings.docx
+++ b/government-savings-automation-assessment/04-leadership/Government-Savings-Automation-Assessment-Review-Findings.docx
@@ -2,9 +2,14 @@
 <file path=word/document.xml><?xml version="1.0" encoding="utf-8"?>
 <w:document xmlns:wpc="http://schemas.microsoft.com/office/word/2010/wordprocessingCanvas" xmlns:mo="http://schemas.microsoft.com/office/mac/office/2008/main" xmlns:mc="http://schemas.openxmlformats.org/markup-compatibility/2006" xmlns:mv="urn:schemas-microsoft-com:mac:vml" xmlns:o="urn:schemas-microsoft-com:office:office" xmlns:r="http://schemas.openxmlformats.org/officeDocument/2006/relationships" xmlns:m="http://schemas.openxmlformats.org/officeDocument/2006/math" xmlns:v="urn:schemas-microsoft-com:vml" xmlns:wp14="http://schemas.microsoft.com/office/word/2010/wordprocessingDrawing" xmlns:wp="http://schemas.openxmlformats.org/drawingml/2006/wordprocessingDrawing" xmlns:w10="urn:schemas-microsoft-com:office:word" xmlns:w="http://schemas.openxmlformats.org/wordprocessingml/2006/main" xmlns:w14="http://schemas.microsoft.com/office/word/2010/wordml" xmlns:wpg="http://schemas.microsoft.com/office/word/2010/wordprocessingGroup" xmlns:wpi="http://schemas.microsoft.com/office/word/2010/wordprocessingInk" xmlns:wne="http://schemas.microsoft.com/office/word/2006/wordml" xmlns:wps="http://schemas.microsoft.com/office/word/2010/wordprocessingShape" mc:Ignorable="w14 wp14">
   <w:body>
+    <w:p/>
+    <w:p/>
+    <w:p/>
+    <w:p/>
     <w:p>
       <w:pPr>
         <w:pStyle w:val="Title"/>
+        <w:jc w:val="center"/>
       </w:pPr>
       <w:r>
         <w:t>Government Savings Automation Assessment</w:t>
@@ -15,7 +20,11 @@
         <w:jc w:val="center"/>
       </w:pPr>
       <w:r>
-        <w:t>Review Findings — Rebuild &amp; Verification</w:t>
+        <w:rPr>
+          <w:rFonts w:ascii="Calibri" w:hAnsi="Calibri"/>
+          <w:b/>
+        </w:rPr>
+        <w:t>Review Findings - Rebuild &amp; Verification</w:t>
       </w:r>
     </w:p>
     <w:p>
@@ -23,7 +32,28 @@
         <w:jc w:val="center"/>
       </w:pPr>
       <w:r>
-        <w:t>Review date: July 21, 2026</w:t>
+        <w:rPr>
+          <w:rFonts w:ascii="Calibri" w:hAnsi="Calibri"/>
+          <w:sz w:val="22"/>
+        </w:rPr>
+        <w:br/>
+        <w:t>Prepared by: Swapnil Patil</w:t>
+        <w:br/>
+        <w:t>QA Automation &amp; Quality Program Lead, Government Savings</w:t>
+        <w:br/>
+        <w:br/>
+        <w:t>Assessment Date: July 20, 2026</w:t>
+        <w:br/>
+        <w:t>Rebuild validated: July 21, 2026</w:t>
+        <w:br/>
+        <w:t>Version: 1.1</w:t>
+        <w:br/>
+        <w:t>Classification: Confidential - Internal Use</w:t>
+      </w:r>
+    </w:p>
+    <w:p>
+      <w:r>
+        <w:br w:type="page"/>
       </w:r>
     </w:p>
     <w:p>
@@ -51,23 +81,36 @@
       <w:tblPr>
         <w:tblStyle w:val="TableGrid"/>
         <w:tblW w:type="auto" w:w="0"/>
+        <w:tblLayout w:type="autofit"/>
         <w:tblLook w:firstColumn="1" w:firstRow="1" w:lastColumn="0" w:lastRow="0" w:noHBand="0" w:noVBand="1" w:val="04A0"/>
       </w:tblPr>
       <w:tblGrid>
-        <w:gridCol w:w="2160"/>
-        <w:gridCol w:w="2160"/>
-        <w:gridCol w:w="2160"/>
-        <w:gridCol w:w="2160"/>
+        <w:gridCol w:w="2340"/>
+        <w:gridCol w:w="2340"/>
+        <w:gridCol w:w="2340"/>
+        <w:gridCol w:w="2340"/>
       </w:tblGrid>
       <w:tr>
         <w:tc>
           <w:tcPr>
-            <w:tcW w:type="dxa" w:w="2160"/>
+            <w:tcW w:type="dxa" w:w="2340"/>
+            <w:shd w:fill="003057" w:val="clear"/>
           </w:tcPr>
           <w:p>
+            <w:pPr>
+              <w:jc w:val="left"/>
+            </w:pPr>
             <w:r>
               <w:rPr>
+                <w:color w:val="FFFFFF"/>
+              </w:rPr>
+            </w:r>
+            <w:r>
+              <w:rPr>
+                <w:rFonts w:ascii="Calibri" w:hAnsi="Calibri"/>
                 <w:b/>
+                <w:color w:val="FFFFFF"/>
+                <w:sz w:val="20"/>
               </w:rPr>
               <w:t>ID</w:t>
             </w:r>
@@ -75,12 +118,24 @@
         </w:tc>
         <w:tc>
           <w:tcPr>
-            <w:tcW w:type="dxa" w:w="2160"/>
+            <w:tcW w:type="dxa" w:w="2340"/>
+            <w:shd w:fill="003057" w:val="clear"/>
           </w:tcPr>
           <w:p>
+            <w:pPr>
+              <w:jc w:val="left"/>
+            </w:pPr>
             <w:r>
               <w:rPr>
+                <w:color w:val="FFFFFF"/>
+              </w:rPr>
+            </w:r>
+            <w:r>
+              <w:rPr>
+                <w:rFonts w:ascii="Calibri" w:hAnsi="Calibri"/>
                 <w:b/>
+                <w:color w:val="FFFFFF"/>
+                <w:sz w:val="20"/>
               </w:rPr>
               <w:t>Severity</w:t>
             </w:r>
@@ -88,12 +143,24 @@
         </w:tc>
         <w:tc>
           <w:tcPr>
-            <w:tcW w:type="dxa" w:w="2160"/>
+            <w:tcW w:type="dxa" w:w="2340"/>
+            <w:shd w:fill="003057" w:val="clear"/>
           </w:tcPr>
           <w:p>
+            <w:pPr>
+              <w:jc w:val="left"/>
+            </w:pPr>
             <w:r>
               <w:rPr>
+                <w:color w:val="FFFFFF"/>
+              </w:rPr>
+            </w:r>
+            <w:r>
+              <w:rPr>
+                <w:rFonts w:ascii="Calibri" w:hAnsi="Calibri"/>
                 <w:b/>
+                <w:color w:val="FFFFFF"/>
+                <w:sz w:val="20"/>
               </w:rPr>
               <w:t>Finding</w:t>
             </w:r>
@@ -101,12 +168,24 @@
         </w:tc>
         <w:tc>
           <w:tcPr>
-            <w:tcW w:type="dxa" w:w="2160"/>
+            <w:tcW w:type="dxa" w:w="2340"/>
+            <w:shd w:fill="003057" w:val="clear"/>
           </w:tcPr>
           <w:p>
+            <w:pPr>
+              <w:jc w:val="left"/>
+            </w:pPr>
             <w:r>
               <w:rPr>
+                <w:color w:val="FFFFFF"/>
+              </w:rPr>
+            </w:r>
+            <w:r>
+              <w:rPr>
+                <w:rFonts w:ascii="Calibri" w:hAnsi="Calibri"/>
                 <w:b/>
+                <w:color w:val="FFFFFF"/>
+                <w:sz w:val="20"/>
               </w:rPr>
               <w:t>Resolution</w:t>
             </w:r>
@@ -116,41 +195,85 @@
       <w:tr>
         <w:tc>
           <w:tcPr>
-            <w:tcW w:type="dxa" w:w="2160"/>
+            <w:tcW w:type="dxa" w:w="2340"/>
+            <w:shd w:fill="FFCDD2" w:val="clear"/>
           </w:tcPr>
           <w:p>
+            <w:pPr>
+              <w:spacing w:after="40"/>
+              <w:jc w:val="left"/>
+            </w:pPr>
+            <w:r/>
             <w:r>
+              <w:rPr>
+                <w:rFonts w:ascii="Calibri" w:hAnsi="Calibri"/>
+                <w:b w:val="0"/>
+                <w:sz w:val="18"/>
+              </w:rPr>
               <w:t>F-01</w:t>
             </w:r>
           </w:p>
         </w:tc>
         <w:tc>
           <w:tcPr>
-            <w:tcW w:type="dxa" w:w="2160"/>
+            <w:tcW w:type="dxa" w:w="2340"/>
+            <w:shd w:fill="FFCDD2" w:val="clear"/>
           </w:tcPr>
           <w:p>
+            <w:pPr>
+              <w:spacing w:after="40"/>
+              <w:jc w:val="left"/>
+            </w:pPr>
+            <w:r/>
             <w:r>
+              <w:rPr>
+                <w:rFonts w:ascii="Calibri" w:hAnsi="Calibri"/>
+                <w:b w:val="0"/>
+                <w:sz w:val="18"/>
+              </w:rPr>
               <w:t>High</w:t>
             </w:r>
           </w:p>
         </w:tc>
         <w:tc>
           <w:tcPr>
-            <w:tcW w:type="dxa" w:w="2160"/>
+            <w:tcW w:type="dxa" w:w="2340"/>
+            <w:shd w:fill="FFCDD2" w:val="clear"/>
           </w:tcPr>
           <w:p>
+            <w:pPr>
+              <w:spacing w:after="40"/>
+              <w:jc w:val="left"/>
+            </w:pPr>
+            <w:r/>
             <w:r>
+              <w:rPr>
+                <w:rFonts w:ascii="Calibri" w:hAnsi="Calibri"/>
+                <w:b w:val="0"/>
+                <w:sz w:val="18"/>
+              </w:rPr>
               <w:t>Mobile 2 100% claim corrected</w:t>
             </w:r>
           </w:p>
         </w:tc>
         <w:tc>
           <w:tcPr>
-            <w:tcW w:type="dxa" w:w="2160"/>
+            <w:tcW w:type="dxa" w:w="2340"/>
+            <w:shd w:fill="FFCDD2" w:val="clear"/>
           </w:tcPr>
           <w:p>
+            <w:pPr>
+              <w:spacing w:after="40"/>
+              <w:jc w:val="left"/>
+            </w:pPr>
+            <w:r/>
             <w:r>
-              <w:t>Prior 24/24 superseded leadership 22/25 (88%). Projected 24/25 (96%) pending sign-off.</w:t>
+              <w:rPr>
+                <w:rFonts w:ascii="Calibri" w:hAnsi="Calibri"/>
+                <w:b w:val="0"/>
+                <w:sz w:val="18"/>
+              </w:rPr>
+              <w:t>Prior 24/24 superseded by leadership 22/25 (88%). Projected 24/25 (96%) pending sign-off.</w:t>
             </w:r>
           </w:p>
         </w:tc>
@@ -158,40 +281,84 @@
       <w:tr>
         <w:tc>
           <w:tcPr>
-            <w:tcW w:type="dxa" w:w="2160"/>
+            <w:tcW w:type="dxa" w:w="2340"/>
+            <w:shd w:fill="FFCDD2" w:val="clear"/>
           </w:tcPr>
           <w:p>
+            <w:pPr>
+              <w:spacing w:after="40"/>
+              <w:jc w:val="left"/>
+            </w:pPr>
+            <w:r/>
             <w:r>
+              <w:rPr>
+                <w:rFonts w:ascii="Calibri" w:hAnsi="Calibri"/>
+                <w:b w:val="0"/>
+                <w:sz w:val="18"/>
+              </w:rPr>
               <w:t>F-02</w:t>
             </w:r>
           </w:p>
         </w:tc>
         <w:tc>
           <w:tcPr>
-            <w:tcW w:type="dxa" w:w="2160"/>
+            <w:tcW w:type="dxa" w:w="2340"/>
+            <w:shd w:fill="FFCDD2" w:val="clear"/>
           </w:tcPr>
           <w:p>
+            <w:pPr>
+              <w:spacing w:after="40"/>
+              <w:jc w:val="left"/>
+            </w:pPr>
+            <w:r/>
             <w:r>
+              <w:rPr>
+                <w:rFonts w:ascii="Calibri" w:hAnsi="Calibri"/>
+                <w:b w:val="0"/>
+                <w:sz w:val="18"/>
+              </w:rPr>
               <w:t>High</w:t>
             </w:r>
           </w:p>
         </w:tc>
         <w:tc>
           <w:tcPr>
-            <w:tcW w:type="dxa" w:w="2160"/>
+            <w:tcW w:type="dxa" w:w="2340"/>
+            <w:shd w:fill="FFCDD2" w:val="clear"/>
           </w:tcPr>
           <w:p>
+            <w:pPr>
+              <w:spacing w:after="40"/>
+              <w:jc w:val="left"/>
+            </w:pPr>
+            <w:r/>
             <w:r>
+              <w:rPr>
+                <w:rFonts w:ascii="Calibri" w:hAnsi="Calibri"/>
+                <w:b w:val="0"/>
+                <w:sz w:val="18"/>
+              </w:rPr>
               <w:t>Mobile 1 verified baseline retained</w:t>
             </w:r>
           </w:p>
         </w:tc>
         <w:tc>
           <w:tcPr>
-            <w:tcW w:type="dxa" w:w="2160"/>
+            <w:tcW w:type="dxa" w:w="2340"/>
+            <w:shd w:fill="FFCDD2" w:val="clear"/>
           </w:tcPr>
           <w:p>
+            <w:pPr>
+              <w:spacing w:after="40"/>
+              <w:jc w:val="left"/>
+            </w:pPr>
+            <w:r/>
             <w:r>
+              <w:rPr>
+                <w:rFonts w:ascii="Calibri" w:hAnsi="Calibri"/>
+                <w:b w:val="0"/>
+                <w:sz w:val="18"/>
+              </w:rPr>
               <w:t>1/27 (3.7%) verified; 6/27 code-implemented pending QC4/Stage1 evidence.</w:t>
             </w:r>
           </w:p>
@@ -200,40 +367,84 @@
       <w:tr>
         <w:tc>
           <w:tcPr>
-            <w:tcW w:type="dxa" w:w="2160"/>
+            <w:tcW w:type="dxa" w:w="2340"/>
+            <w:shd w:fill="FFE0B2" w:val="clear"/>
           </w:tcPr>
           <w:p>
+            <w:pPr>
+              <w:spacing w:after="40"/>
+              <w:jc w:val="left"/>
+            </w:pPr>
+            <w:r/>
             <w:r>
+              <w:rPr>
+                <w:rFonts w:ascii="Calibri" w:hAnsi="Calibri"/>
+                <w:b w:val="0"/>
+                <w:sz w:val="18"/>
+              </w:rPr>
               <w:t>F-03</w:t>
             </w:r>
           </w:p>
         </w:tc>
         <w:tc>
           <w:tcPr>
-            <w:tcW w:type="dxa" w:w="2160"/>
+            <w:tcW w:type="dxa" w:w="2340"/>
+            <w:shd w:fill="FFE0B2" w:val="clear"/>
           </w:tcPr>
           <w:p>
+            <w:pPr>
+              <w:spacing w:after="40"/>
+              <w:jc w:val="left"/>
+            </w:pPr>
+            <w:r/>
             <w:r>
+              <w:rPr>
+                <w:rFonts w:ascii="Calibri" w:hAnsi="Calibri"/>
+                <w:b w:val="0"/>
+                <w:sz w:val="18"/>
+              </w:rPr>
               <w:t>Medium</w:t>
             </w:r>
           </w:p>
         </w:tc>
         <w:tc>
           <w:tcPr>
-            <w:tcW w:type="dxa" w:w="2160"/>
+            <w:tcW w:type="dxa" w:w="2340"/>
+            <w:shd w:fill="FFE0B2" w:val="clear"/>
           </w:tcPr>
           <w:p>
+            <w:pPr>
+              <w:spacing w:after="40"/>
+              <w:jc w:val="left"/>
+            </w:pPr>
+            <w:r/>
             <w:r>
+              <w:rPr>
+                <w:rFonts w:ascii="Calibri" w:hAnsi="Calibri"/>
+                <w:b w:val="0"/>
+                <w:sz w:val="18"/>
+              </w:rPr>
               <w:t>GitHub Actions wording corrected</w:t>
             </w:r>
           </w:p>
         </w:tc>
         <w:tc>
           <w:tcPr>
-            <w:tcW w:type="dxa" w:w="2160"/>
+            <w:tcW w:type="dxa" w:w="2340"/>
+            <w:shd w:fill="FFE0B2" w:val="clear"/>
           </w:tcPr>
           <w:p>
+            <w:pPr>
+              <w:spacing w:after="40"/>
+              <w:jc w:val="left"/>
+            </w:pPr>
+            <w:r/>
             <w:r>
+              <w:rPr>
+                <w:rFonts w:ascii="Calibri" w:hAnsi="Calibri"/>
+                <w:b w:val="0"/>
+                <w:sz w:val="18"/>
+              </w:rPr>
               <w:t>Dashboard slice externally validated; not equivalent to absent implementation.</w:t>
             </w:r>
           </w:p>
@@ -242,41 +453,85 @@
       <w:tr>
         <w:tc>
           <w:tcPr>
-            <w:tcW w:type="dxa" w:w="2160"/>
+            <w:tcW w:type="dxa" w:w="2340"/>
+            <w:shd w:fill="FFE0B2" w:val="clear"/>
           </w:tcPr>
           <w:p>
+            <w:pPr>
+              <w:spacing w:after="40"/>
+              <w:jc w:val="left"/>
+            </w:pPr>
+            <w:r/>
             <w:r>
+              <w:rPr>
+                <w:rFonts w:ascii="Calibri" w:hAnsi="Calibri"/>
+                <w:b w:val="0"/>
+                <w:sz w:val="18"/>
+              </w:rPr>
               <w:t>F-04</w:t>
             </w:r>
           </w:p>
         </w:tc>
         <w:tc>
           <w:tcPr>
-            <w:tcW w:type="dxa" w:w="2160"/>
+            <w:tcW w:type="dxa" w:w="2340"/>
+            <w:shd w:fill="FFE0B2" w:val="clear"/>
           </w:tcPr>
           <w:p>
+            <w:pPr>
+              <w:spacing w:after="40"/>
+              <w:jc w:val="left"/>
+            </w:pPr>
+            <w:r/>
             <w:r>
+              <w:rPr>
+                <w:rFonts w:ascii="Calibri" w:hAnsi="Calibri"/>
+                <w:b w:val="0"/>
+                <w:sz w:val="18"/>
+              </w:rPr>
               <w:t>Medium</w:t>
             </w:r>
           </w:p>
         </w:tc>
         <w:tc>
           <w:tcPr>
-            <w:tcW w:type="dxa" w:w="2160"/>
+            <w:tcW w:type="dxa" w:w="2340"/>
+            <w:shd w:fill="FFE0B2" w:val="clear"/>
           </w:tcPr>
           <w:p>
+            <w:pPr>
+              <w:spacing w:after="40"/>
+              <w:jc w:val="left"/>
+            </w:pPr>
+            <w:r/>
             <w:r>
+              <w:rPr>
+                <w:rFonts w:ascii="Calibri" w:hAnsi="Calibri"/>
+                <w:b w:val="0"/>
+                <w:sz w:val="18"/>
+              </w:rPr>
               <w:t>CI gate terminology corrected</w:t>
             </w:r>
           </w:p>
         </w:tc>
         <w:tc>
           <w:tcPr>
-            <w:tcW w:type="dxa" w:w="2160"/>
+            <w:tcW w:type="dxa" w:w="2340"/>
+            <w:shd w:fill="FFE0B2" w:val="clear"/>
           </w:tcPr>
           <w:p>
+            <w:pPr>
+              <w:spacing w:after="40"/>
+              <w:jc w:val="left"/>
+            </w:pPr>
+            <w:r/>
             <w:r>
-              <w:t>Scheduled hard-fail ≠ merge/deployment gate without pipeline rule evidence.</w:t>
+              <w:rPr>
+                <w:rFonts w:ascii="Calibri" w:hAnsi="Calibri"/>
+                <w:b w:val="0"/>
+                <w:sz w:val="18"/>
+              </w:rPr>
+              <w:t>Scheduled hard-fail is not a merge/deployment gate without pipeline rule evidence.</w:t>
             </w:r>
           </w:p>
         </w:tc>
@@ -284,41 +539,85 @@
       <w:tr>
         <w:tc>
           <w:tcPr>
-            <w:tcW w:type="dxa" w:w="2160"/>
+            <w:tcW w:type="dxa" w:w="2340"/>
+            <w:shd w:fill="FFCDD2" w:val="clear"/>
           </w:tcPr>
           <w:p>
+            <w:pPr>
+              <w:spacing w:after="40"/>
+              <w:jc w:val="left"/>
+            </w:pPr>
+            <w:r/>
             <w:r>
+              <w:rPr>
+                <w:rFonts w:ascii="Calibri" w:hAnsi="Calibri"/>
+                <w:b w:val="0"/>
+                <w:sz w:val="18"/>
+              </w:rPr>
               <w:t>F-05</w:t>
             </w:r>
           </w:p>
         </w:tc>
         <w:tc>
           <w:tcPr>
-            <w:tcW w:type="dxa" w:w="2160"/>
+            <w:tcW w:type="dxa" w:w="2340"/>
+            <w:shd w:fill="FFCDD2" w:val="clear"/>
           </w:tcPr>
           <w:p>
+            <w:pPr>
+              <w:spacing w:after="40"/>
+              <w:jc w:val="left"/>
+            </w:pPr>
+            <w:r/>
             <w:r>
+              <w:rPr>
+                <w:rFonts w:ascii="Calibri" w:hAnsi="Calibri"/>
+                <w:b w:val="0"/>
+                <w:sz w:val="18"/>
+              </w:rPr>
               <w:t>High</w:t>
             </w:r>
           </w:p>
         </w:tc>
         <w:tc>
           <w:tcPr>
-            <w:tcW w:type="dxa" w:w="2160"/>
+            <w:tcW w:type="dxa" w:w="2340"/>
+            <w:shd w:fill="FFCDD2" w:val="clear"/>
           </w:tcPr>
           <w:p>
+            <w:pPr>
+              <w:spacing w:after="40"/>
+              <w:jc w:val="left"/>
+            </w:pPr>
+            <w:r/>
             <w:r>
+              <w:rPr>
+                <w:rFonts w:ascii="Calibri" w:hAnsi="Calibri"/>
+                <w:b w:val="0"/>
+                <w:sz w:val="18"/>
+              </w:rPr>
               <w:t>No GS-wide %</w:t>
             </w:r>
           </w:p>
         </w:tc>
         <w:tc>
           <w:tcPr>
-            <w:tcW w:type="dxa" w:w="2160"/>
+            <w:tcW w:type="dxa" w:w="2340"/>
+            <w:shd w:fill="FFCDD2" w:val="clear"/>
           </w:tcPr>
           <w:p>
+            <w:pPr>
+              <w:spacing w:after="40"/>
+              <w:jc w:val="left"/>
+            </w:pPr>
+            <w:r/>
             <w:r>
-              <w:t>Enterprise percentage remains undefined — by design.</w:t>
+              <w:rPr>
+                <w:rFonts w:ascii="Calibri" w:hAnsi="Calibri"/>
+                <w:b w:val="0"/>
+                <w:sz w:val="18"/>
+              </w:rPr>
+              <w:t>Enterprise percentage remains undefined by design.</w:t>
             </w:r>
           </w:p>
         </w:tc>
@@ -326,41 +625,1137 @@
       <w:tr>
         <w:tc>
           <w:tcPr>
-            <w:tcW w:type="dxa" w:w="2160"/>
+            <w:tcW w:type="dxa" w:w="2340"/>
+            <w:shd w:fill="ECEFF1" w:val="clear"/>
           </w:tcPr>
           <w:p>
+            <w:pPr>
+              <w:spacing w:after="40"/>
+              <w:jc w:val="left"/>
+            </w:pPr>
+            <w:r/>
             <w:r>
+              <w:rPr>
+                <w:rFonts w:ascii="Calibri" w:hAnsi="Calibri"/>
+                <w:b w:val="0"/>
+                <w:sz w:val="18"/>
+              </w:rPr>
               <w:t>F-06</w:t>
             </w:r>
           </w:p>
         </w:tc>
         <w:tc>
           <w:tcPr>
-            <w:tcW w:type="dxa" w:w="2160"/>
+            <w:tcW w:type="dxa" w:w="2340"/>
+            <w:shd w:fill="ECEFF1" w:val="clear"/>
           </w:tcPr>
           <w:p>
+            <w:pPr>
+              <w:spacing w:after="40"/>
+              <w:jc w:val="left"/>
+            </w:pPr>
+            <w:r/>
             <w:r>
+              <w:rPr>
+                <w:rFonts w:ascii="Calibri" w:hAnsi="Calibri"/>
+                <w:b w:val="0"/>
+                <w:sz w:val="18"/>
+              </w:rPr>
               <w:t>Low</w:t>
             </w:r>
           </w:p>
         </w:tc>
         <w:tc>
           <w:tcPr>
-            <w:tcW w:type="dxa" w:w="2160"/>
+            <w:tcW w:type="dxa" w:w="2340"/>
+            <w:shd w:fill="ECEFF1" w:val="clear"/>
           </w:tcPr>
           <w:p>
+            <w:pPr>
+              <w:spacing w:after="40"/>
+              <w:jc w:val="left"/>
+            </w:pPr>
+            <w:r/>
             <w:r>
+              <w:rPr>
+                <w:rFonts w:ascii="Calibri" w:hAnsi="Calibri"/>
+                <w:b w:val="0"/>
+                <w:sz w:val="18"/>
+              </w:rPr>
               <w:t>COPACS scope unknown</w:t>
             </w:r>
           </w:p>
         </w:tc>
         <w:tc>
           <w:tcPr>
-            <w:tcW w:type="dxa" w:w="2160"/>
+            <w:tcW w:type="dxa" w:w="2340"/>
+            <w:shd w:fill="ECEFF1" w:val="clear"/>
           </w:tcPr>
           <w:p>
+            <w:pPr>
+              <w:spacing w:after="40"/>
+              <w:jc w:val="left"/>
+            </w:pPr>
+            <w:r/>
             <w:r>
+              <w:rPr>
+                <w:rFonts w:ascii="Calibri" w:hAnsi="Calibri"/>
+                <w:b w:val="0"/>
+                <w:sz w:val="18"/>
+              </w:rPr>
               <w:t>No automation repository identified in reviewed set.</w:t>
+            </w:r>
+          </w:p>
+        </w:tc>
+      </w:tr>
+    </w:tbl>
+    <w:p/>
+    <w:p>
+      <w:r>
+        <w:br w:type="page"/>
+      </w:r>
+    </w:p>
+    <w:p>
+      <w:pPr>
+        <w:pStyle w:val="Heading1"/>
+      </w:pPr>
+      <w:r>
+        <w:t>Contradictions Resolved</w:t>
+      </w:r>
+    </w:p>
+    <w:tbl>
+      <w:tblPr>
+        <w:tblStyle w:val="TableGrid"/>
+        <w:tblW w:type="auto" w:w="0"/>
+        <w:tblLayout w:type="autofit"/>
+        <w:tblLook w:firstColumn="1" w:firstRow="1" w:lastColumn="0" w:lastRow="0" w:noHBand="0" w:noVBand="1" w:val="04A0"/>
+      </w:tblPr>
+      <w:tblGrid>
+        <w:gridCol w:w="2340"/>
+        <w:gridCol w:w="2340"/>
+        <w:gridCol w:w="2340"/>
+        <w:gridCol w:w="2340"/>
+      </w:tblGrid>
+      <w:tr>
+        <w:tc>
+          <w:tcPr>
+            <w:tcW w:type="dxa" w:w="2340"/>
+            <w:shd w:fill="003057" w:val="clear"/>
+          </w:tcPr>
+          <w:p>
+            <w:pPr>
+              <w:jc w:val="left"/>
+            </w:pPr>
+            <w:r>
+              <w:rPr>
+                <w:color w:val="FFFFFF"/>
+              </w:rPr>
+            </w:r>
+            <w:r>
+              <w:rPr>
+                <w:rFonts w:ascii="Calibri" w:hAnsi="Calibri"/>
+                <w:b/>
+                <w:color w:val="FFFFFF"/>
+                <w:sz w:val="20"/>
+              </w:rPr>
+              <w:t>ID</w:t>
+            </w:r>
+          </w:p>
+        </w:tc>
+        <w:tc>
+          <w:tcPr>
+            <w:tcW w:type="dxa" w:w="2340"/>
+            <w:shd w:fill="003057" w:val="clear"/>
+          </w:tcPr>
+          <w:p>
+            <w:pPr>
+              <w:jc w:val="left"/>
+            </w:pPr>
+            <w:r>
+              <w:rPr>
+                <w:color w:val="FFFFFF"/>
+              </w:rPr>
+            </w:r>
+            <w:r>
+              <w:rPr>
+                <w:rFonts w:ascii="Calibri" w:hAnsi="Calibri"/>
+                <w:b/>
+                <w:color w:val="FFFFFF"/>
+                <w:sz w:val="20"/>
+              </w:rPr>
+              <w:t>Topic</w:t>
+            </w:r>
+          </w:p>
+        </w:tc>
+        <w:tc>
+          <w:tcPr>
+            <w:tcW w:type="dxa" w:w="2340"/>
+            <w:shd w:fill="003057" w:val="clear"/>
+          </w:tcPr>
+          <w:p>
+            <w:pPr>
+              <w:jc w:val="left"/>
+            </w:pPr>
+            <w:r>
+              <w:rPr>
+                <w:color w:val="FFFFFF"/>
+              </w:rPr>
+            </w:r>
+            <w:r>
+              <w:rPr>
+                <w:rFonts w:ascii="Calibri" w:hAnsi="Calibri"/>
+                <w:b/>
+                <w:color w:val="FFFFFF"/>
+                <w:sz w:val="20"/>
+              </w:rPr>
+              <w:t>Corrected claim</w:t>
+            </w:r>
+          </w:p>
+        </w:tc>
+        <w:tc>
+          <w:tcPr>
+            <w:tcW w:type="dxa" w:w="2340"/>
+            <w:shd w:fill="003057" w:val="clear"/>
+          </w:tcPr>
+          <w:p>
+            <w:pPr>
+              <w:jc w:val="left"/>
+            </w:pPr>
+            <w:r>
+              <w:rPr>
+                <w:color w:val="FFFFFF"/>
+              </w:rPr>
+            </w:r>
+            <w:r>
+              <w:rPr>
+                <w:rFonts w:ascii="Calibri" w:hAnsi="Calibri"/>
+                <w:b/>
+                <w:color w:val="FFFFFF"/>
+                <w:sz w:val="20"/>
+              </w:rPr>
+              <w:t>Status</w:t>
+            </w:r>
+          </w:p>
+        </w:tc>
+      </w:tr>
+      <w:tr>
+        <w:tc>
+          <w:tcPr>
+            <w:tcW w:type="dxa" w:w="2340"/>
+          </w:tcPr>
+          <w:p>
+            <w:pPr>
+              <w:spacing w:after="40"/>
+              <w:jc w:val="left"/>
+            </w:pPr>
+            <w:r/>
+            <w:r>
+              <w:rPr>
+                <w:rFonts w:ascii="Calibri" w:hAnsi="Calibri"/>
+                <w:b w:val="0"/>
+                <w:sz w:val="18"/>
+              </w:rPr>
+              <w:t>C-01</w:t>
+            </w:r>
+          </w:p>
+        </w:tc>
+        <w:tc>
+          <w:tcPr>
+            <w:tcW w:type="dxa" w:w="2340"/>
+          </w:tcPr>
+          <w:p>
+            <w:pPr>
+              <w:spacing w:after="40"/>
+              <w:jc w:val="left"/>
+            </w:pPr>
+            <w:r/>
+            <w:r>
+              <w:rPr>
+                <w:rFonts w:ascii="Calibri" w:hAnsi="Calibri"/>
+                <w:b w:val="0"/>
+                <w:sz w:val="18"/>
+              </w:rPr>
+              <w:t>Mobile 2 coverage</w:t>
+            </w:r>
+          </w:p>
+        </w:tc>
+        <w:tc>
+          <w:tcPr>
+            <w:tcW w:type="dxa" w:w="2340"/>
+          </w:tcPr>
+          <w:p>
+            <w:pPr>
+              <w:spacing w:after="40"/>
+              <w:jc w:val="left"/>
+            </w:pPr>
+            <w:r/>
+            <w:r>
+              <w:rPr>
+                <w:rFonts w:ascii="Calibri" w:hAnsi="Calibri"/>
+                <w:b w:val="0"/>
+                <w:sz w:val="18"/>
+              </w:rPr>
+              <w:t>Verified: 22/25 (88.0%) · Pending sign-off: 24/25 (96.0%) projected</w:t>
+            </w:r>
+          </w:p>
+        </w:tc>
+        <w:tc>
+          <w:tcPr>
+            <w:tcW w:type="dxa" w:w="2340"/>
+          </w:tcPr>
+          <w:p>
+            <w:pPr>
+              <w:spacing w:after="40"/>
+              <w:jc w:val="left"/>
+            </w:pPr>
+            <w:r/>
+            <w:r>
+              <w:rPr>
+                <w:rFonts w:ascii="Calibri" w:hAnsi="Calibri"/>
+                <w:b w:val="0"/>
+                <w:sz w:val="18"/>
+              </w:rPr>
+              <w:t>Corrected</w:t>
+            </w:r>
+          </w:p>
+        </w:tc>
+      </w:tr>
+      <w:tr>
+        <w:tc>
+          <w:tcPr>
+            <w:tcW w:type="dxa" w:w="2340"/>
+            <w:shd w:fill="ECEFF1" w:val="clear"/>
+          </w:tcPr>
+          <w:p>
+            <w:pPr>
+              <w:spacing w:after="40"/>
+              <w:jc w:val="left"/>
+            </w:pPr>
+            <w:r/>
+            <w:r>
+              <w:rPr>
+                <w:rFonts w:ascii="Calibri" w:hAnsi="Calibri"/>
+                <w:b w:val="0"/>
+                <w:sz w:val="18"/>
+              </w:rPr>
+              <w:t>C-02</w:t>
+            </w:r>
+          </w:p>
+        </w:tc>
+        <w:tc>
+          <w:tcPr>
+            <w:tcW w:type="dxa" w:w="2340"/>
+            <w:shd w:fill="ECEFF1" w:val="clear"/>
+          </w:tcPr>
+          <w:p>
+            <w:pPr>
+              <w:spacing w:after="40"/>
+              <w:jc w:val="left"/>
+            </w:pPr>
+            <w:r/>
+            <w:r>
+              <w:rPr>
+                <w:rFonts w:ascii="Calibri" w:hAnsi="Calibri"/>
+                <w:b w:val="0"/>
+                <w:sz w:val="18"/>
+              </w:rPr>
+              <w:t>Mobile 2 superseded</w:t>
+            </w:r>
+          </w:p>
+        </w:tc>
+        <w:tc>
+          <w:tcPr>
+            <w:tcW w:type="dxa" w:w="2340"/>
+            <w:shd w:fill="ECEFF1" w:val="clear"/>
+          </w:tcPr>
+          <w:p>
+            <w:pPr>
+              <w:spacing w:after="40"/>
+              <w:jc w:val="left"/>
+            </w:pPr>
+            <w:r/>
+            <w:r>
+              <w:rPr>
+                <w:rFonts w:ascii="Calibri" w:hAnsi="Calibri"/>
+                <w:b w:val="0"/>
+                <w:sz w:val="18"/>
+              </w:rPr>
+              <w:t>88% remains verified leadership baseline; 96% is pending only</w:t>
+            </w:r>
+          </w:p>
+        </w:tc>
+        <w:tc>
+          <w:tcPr>
+            <w:tcW w:type="dxa" w:w="2340"/>
+            <w:shd w:fill="ECEFF1" w:val="clear"/>
+          </w:tcPr>
+          <w:p>
+            <w:pPr>
+              <w:spacing w:after="40"/>
+              <w:jc w:val="left"/>
+            </w:pPr>
+            <w:r/>
+            <w:r>
+              <w:rPr>
+                <w:rFonts w:ascii="Calibri" w:hAnsi="Calibri"/>
+                <w:b w:val="0"/>
+                <w:sz w:val="18"/>
+              </w:rPr>
+              <w:t>Corrected</w:t>
+            </w:r>
+          </w:p>
+        </w:tc>
+      </w:tr>
+      <w:tr>
+        <w:tc>
+          <w:tcPr>
+            <w:tcW w:type="dxa" w:w="2340"/>
+          </w:tcPr>
+          <w:p>
+            <w:pPr>
+              <w:spacing w:after="40"/>
+              <w:jc w:val="left"/>
+            </w:pPr>
+            <w:r/>
+            <w:r>
+              <w:rPr>
+                <w:rFonts w:ascii="Calibri" w:hAnsi="Calibri"/>
+                <w:b w:val="0"/>
+                <w:sz w:val="18"/>
+              </w:rPr>
+              <w:t>C-03</w:t>
+            </w:r>
+          </w:p>
+        </w:tc>
+        <w:tc>
+          <w:tcPr>
+            <w:tcW w:type="dxa" w:w="2340"/>
+          </w:tcPr>
+          <w:p>
+            <w:pPr>
+              <w:spacing w:after="40"/>
+              <w:jc w:val="left"/>
+            </w:pPr>
+            <w:r/>
+            <w:r>
+              <w:rPr>
+                <w:rFonts w:ascii="Calibri" w:hAnsi="Calibri"/>
+                <w:b w:val="0"/>
+                <w:sz w:val="18"/>
+              </w:rPr>
+              <w:t>Mobile 1 coverage</w:t>
+            </w:r>
+          </w:p>
+        </w:tc>
+        <w:tc>
+          <w:tcPr>
+            <w:tcW w:type="dxa" w:w="2340"/>
+          </w:tcPr>
+          <w:p>
+            <w:pPr>
+              <w:spacing w:after="40"/>
+              <w:jc w:val="left"/>
+            </w:pPr>
+            <w:r/>
+            <w:r>
+              <w:rPr>
+                <w:rFonts w:ascii="Calibri" w:hAnsi="Calibri"/>
+                <w:b w:val="0"/>
+                <w:sz w:val="18"/>
+              </w:rPr>
+              <w:t>Verified: 1/27 (3.7%) · Implemented pending: 5 endpoints (potential 6/27)</w:t>
+            </w:r>
+          </w:p>
+        </w:tc>
+        <w:tc>
+          <w:tcPr>
+            <w:tcW w:type="dxa" w:w="2340"/>
+          </w:tcPr>
+          <w:p>
+            <w:pPr>
+              <w:spacing w:after="40"/>
+              <w:jc w:val="left"/>
+            </w:pPr>
+            <w:r/>
+            <w:r>
+              <w:rPr>
+                <w:rFonts w:ascii="Calibri" w:hAnsi="Calibri"/>
+                <w:b w:val="0"/>
+                <w:sz w:val="18"/>
+              </w:rPr>
+              <w:t>Corrected</w:t>
+            </w:r>
+          </w:p>
+        </w:tc>
+      </w:tr>
+      <w:tr>
+        <w:tc>
+          <w:tcPr>
+            <w:tcW w:type="dxa" w:w="2340"/>
+            <w:shd w:fill="ECEFF1" w:val="clear"/>
+          </w:tcPr>
+          <w:p>
+            <w:pPr>
+              <w:spacing w:after="40"/>
+              <w:jc w:val="left"/>
+            </w:pPr>
+            <w:r/>
+            <w:r>
+              <w:rPr>
+                <w:rFonts w:ascii="Calibri" w:hAnsi="Calibri"/>
+                <w:b w:val="0"/>
+                <w:sz w:val="18"/>
+              </w:rPr>
+              <w:t>C-04</w:t>
+            </w:r>
+          </w:p>
+        </w:tc>
+        <w:tc>
+          <w:tcPr>
+            <w:tcW w:type="dxa" w:w="2340"/>
+            <w:shd w:fill="ECEFF1" w:val="clear"/>
+          </w:tcPr>
+          <w:p>
+            <w:pPr>
+              <w:spacing w:after="40"/>
+              <w:jc w:val="left"/>
+            </w:pPr>
+            <w:r/>
+            <w:r>
+              <w:rPr>
+                <w:rFonts w:ascii="Calibri" w:hAnsi="Calibri"/>
+                <w:b w:val="0"/>
+                <w:sz w:val="18"/>
+              </w:rPr>
+              <w:t>GitHub Actions</w:t>
+            </w:r>
+          </w:p>
+        </w:tc>
+        <w:tc>
+          <w:tcPr>
+            <w:tcW w:type="dxa" w:w="2340"/>
+            <w:shd w:fill="ECEFF1" w:val="clear"/>
+          </w:tcPr>
+          <w:p>
+            <w:pPr>
+              <w:spacing w:after="40"/>
+              <w:jc w:val="left"/>
+            </w:pPr>
+            <w:r/>
+            <w:r>
+              <w:rPr>
+                <w:rFonts w:ascii="Calibri" w:hAnsi="Calibri"/>
+                <w:b w:val="0"/>
+                <w:sz w:val="18"/>
+              </w:rPr>
+              <w:t>Dashboard vertical slice externally validated; module expansion in progress; workflow repo not in audit clone</w:t>
+            </w:r>
+          </w:p>
+        </w:tc>
+        <w:tc>
+          <w:tcPr>
+            <w:tcW w:type="dxa" w:w="2340"/>
+            <w:shd w:fill="ECEFF1" w:val="clear"/>
+          </w:tcPr>
+          <w:p>
+            <w:pPr>
+              <w:spacing w:after="40"/>
+              <w:jc w:val="left"/>
+            </w:pPr>
+            <w:r/>
+            <w:r>
+              <w:rPr>
+                <w:rFonts w:ascii="Calibri" w:hAnsi="Calibri"/>
+                <w:b w:val="0"/>
+                <w:sz w:val="18"/>
+              </w:rPr>
+              <w:t>Corrected</w:t>
+            </w:r>
+          </w:p>
+        </w:tc>
+      </w:tr>
+      <w:tr>
+        <w:tc>
+          <w:tcPr>
+            <w:tcW w:type="dxa" w:w="2340"/>
+          </w:tcPr>
+          <w:p>
+            <w:pPr>
+              <w:spacing w:after="40"/>
+              <w:jc w:val="left"/>
+            </w:pPr>
+            <w:r/>
+            <w:r>
+              <w:rPr>
+                <w:rFonts w:ascii="Calibri" w:hAnsi="Calibri"/>
+                <w:b w:val="0"/>
+                <w:sz w:val="18"/>
+              </w:rPr>
+              <w:t>C-05</w:t>
+            </w:r>
+          </w:p>
+        </w:tc>
+        <w:tc>
+          <w:tcPr>
+            <w:tcW w:type="dxa" w:w="2340"/>
+          </w:tcPr>
+          <w:p>
+            <w:pPr>
+              <w:spacing w:after="40"/>
+              <w:jc w:val="left"/>
+            </w:pPr>
+            <w:r/>
+            <w:r>
+              <w:rPr>
+                <w:rFonts w:ascii="Calibri" w:hAnsi="Calibri"/>
+                <w:b w:val="0"/>
+                <w:sz w:val="18"/>
+              </w:rPr>
+              <w:t>CI "hard gate"</w:t>
+            </w:r>
+          </w:p>
+        </w:tc>
+        <w:tc>
+          <w:tcPr>
+            <w:tcW w:type="dxa" w:w="2340"/>
+          </w:tcPr>
+          <w:p>
+            <w:pPr>
+              <w:spacing w:after="40"/>
+              <w:jc w:val="left"/>
+            </w:pPr>
+            <w:r/>
+            <w:r>
+              <w:rPr>
+                <w:rFonts w:ascii="Calibri" w:hAnsi="Calibri"/>
+                <w:b w:val="0"/>
+                <w:sz w:val="18"/>
+              </w:rPr>
+              <w:t>Scheduled regression - hard-fail on run; not verified MR/deployment gate</w:t>
+            </w:r>
+          </w:p>
+        </w:tc>
+        <w:tc>
+          <w:tcPr>
+            <w:tcW w:type="dxa" w:w="2340"/>
+          </w:tcPr>
+          <w:p>
+            <w:pPr>
+              <w:spacing w:after="40"/>
+              <w:jc w:val="left"/>
+            </w:pPr>
+            <w:r/>
+            <w:r>
+              <w:rPr>
+                <w:rFonts w:ascii="Calibri" w:hAnsi="Calibri"/>
+                <w:b w:val="0"/>
+                <w:sz w:val="18"/>
+              </w:rPr>
+              <w:t>Corrected</w:t>
+            </w:r>
+          </w:p>
+        </w:tc>
+      </w:tr>
+      <w:tr>
+        <w:tc>
+          <w:tcPr>
+            <w:tcW w:type="dxa" w:w="2340"/>
+            <w:shd w:fill="ECEFF1" w:val="clear"/>
+          </w:tcPr>
+          <w:p>
+            <w:pPr>
+              <w:spacing w:after="40"/>
+              <w:jc w:val="left"/>
+            </w:pPr>
+            <w:r/>
+            <w:r>
+              <w:rPr>
+                <w:rFonts w:ascii="Calibri" w:hAnsi="Calibri"/>
+                <w:b w:val="0"/>
+                <w:sz w:val="18"/>
+              </w:rPr>
+              <w:t>C-06</w:t>
+            </w:r>
+          </w:p>
+        </w:tc>
+        <w:tc>
+          <w:tcPr>
+            <w:tcW w:type="dxa" w:w="2340"/>
+            <w:shd w:fill="ECEFF1" w:val="clear"/>
+          </w:tcPr>
+          <w:p>
+            <w:pPr>
+              <w:spacing w:after="40"/>
+              <w:jc w:val="left"/>
+            </w:pPr>
+            <w:r/>
+            <w:r>
+              <w:rPr>
+                <w:rFonts w:ascii="Calibri" w:hAnsi="Calibri"/>
+                <w:b w:val="0"/>
+                <w:sz w:val="18"/>
+              </w:rPr>
+              <w:t>V2 recurring</w:t>
+            </w:r>
+          </w:p>
+        </w:tc>
+        <w:tc>
+          <w:tcPr>
+            <w:tcW w:type="dxa" w:w="2340"/>
+            <w:shd w:fill="ECEFF1" w:val="clear"/>
+          </w:tcPr>
+          <w:p>
+            <w:pPr>
+              <w:spacing w:after="40"/>
+              <w:jc w:val="left"/>
+            </w:pPr>
+            <w:r/>
+            <w:r>
+              <w:rPr>
+                <w:rFonts w:ascii="Calibri" w:hAnsi="Calibri"/>
+                <w:b w:val="0"/>
+                <w:sz w:val="18"/>
+              </w:rPr>
+              <w:t>Automation exists; recurring schedule Unknown</w:t>
+            </w:r>
+          </w:p>
+        </w:tc>
+        <w:tc>
+          <w:tcPr>
+            <w:tcW w:type="dxa" w:w="2340"/>
+            <w:shd w:fill="ECEFF1" w:val="clear"/>
+          </w:tcPr>
+          <w:p>
+            <w:pPr>
+              <w:spacing w:after="40"/>
+              <w:jc w:val="left"/>
+            </w:pPr>
+            <w:r/>
+            <w:r>
+              <w:rPr>
+                <w:rFonts w:ascii="Calibri" w:hAnsi="Calibri"/>
+                <w:b w:val="0"/>
+                <w:sz w:val="18"/>
+              </w:rPr>
+              <w:t>Corrected</w:t>
+            </w:r>
+          </w:p>
+        </w:tc>
+      </w:tr>
+      <w:tr>
+        <w:tc>
+          <w:tcPr>
+            <w:tcW w:type="dxa" w:w="2340"/>
+          </w:tcPr>
+          <w:p>
+            <w:pPr>
+              <w:spacing w:after="40"/>
+              <w:jc w:val="left"/>
+            </w:pPr>
+            <w:r/>
+            <w:r>
+              <w:rPr>
+                <w:rFonts w:ascii="Calibri" w:hAnsi="Calibri"/>
+                <w:b w:val="0"/>
+                <w:sz w:val="18"/>
+              </w:rPr>
+              <w:t>C-07</w:t>
+            </w:r>
+          </w:p>
+        </w:tc>
+        <w:tc>
+          <w:tcPr>
+            <w:tcW w:type="dxa" w:w="2340"/>
+          </w:tcPr>
+          <w:p>
+            <w:pPr>
+              <w:spacing w:after="40"/>
+              <w:jc w:val="left"/>
+            </w:pPr>
+            <w:r/>
+            <w:r>
+              <w:rPr>
+                <w:rFonts w:ascii="Calibri" w:hAnsi="Calibri"/>
+                <w:b w:val="0"/>
+                <w:sz w:val="18"/>
+              </w:rPr>
+              <w:t>Metadata API scope</w:t>
+            </w:r>
+          </w:p>
+        </w:tc>
+        <w:tc>
+          <w:tcPr>
+            <w:tcW w:type="dxa" w:w="2340"/>
+          </w:tcPr>
+          <w:p>
+            <w:pPr>
+              <w:spacing w:after="40"/>
+              <w:jc w:val="left"/>
+            </w:pPr>
+            <w:r/>
+            <w:r>
+              <w:rPr>
+                <w:rFonts w:ascii="Calibri" w:hAnsi="Calibri"/>
+                <w:b w:val="0"/>
+                <w:sz w:val="18"/>
+              </w:rPr>
+              <w:t>Metadataweb module on schedule; other universal modules manual only</w:t>
+            </w:r>
+          </w:p>
+        </w:tc>
+        <w:tc>
+          <w:tcPr>
+            <w:tcW w:type="dxa" w:w="2340"/>
+          </w:tcPr>
+          <w:p>
+            <w:pPr>
+              <w:spacing w:after="40"/>
+              <w:jc w:val="left"/>
+            </w:pPr>
+            <w:r/>
+            <w:r>
+              <w:rPr>
+                <w:rFonts w:ascii="Calibri" w:hAnsi="Calibri"/>
+                <w:b w:val="0"/>
+                <w:sz w:val="18"/>
+              </w:rPr>
+              <w:t>Clarified</w:t>
+            </w:r>
+          </w:p>
+        </w:tc>
+      </w:tr>
+      <w:tr>
+        <w:tc>
+          <w:tcPr>
+            <w:tcW w:type="dxa" w:w="2340"/>
+            <w:shd w:fill="ECEFF1" w:val="clear"/>
+          </w:tcPr>
+          <w:p>
+            <w:pPr>
+              <w:spacing w:after="40"/>
+              <w:jc w:val="left"/>
+            </w:pPr>
+            <w:r/>
+            <w:r>
+              <w:rPr>
+                <w:rFonts w:ascii="Calibri" w:hAnsi="Calibri"/>
+                <w:b w:val="0"/>
+                <w:sz w:val="18"/>
+              </w:rPr>
+              <w:t>C-08</w:t>
+            </w:r>
+          </w:p>
+        </w:tc>
+        <w:tc>
+          <w:tcPr>
+            <w:tcW w:type="dxa" w:w="2340"/>
+            <w:shd w:fill="ECEFF1" w:val="clear"/>
+          </w:tcPr>
+          <w:p>
+            <w:pPr>
+              <w:spacing w:after="40"/>
+              <w:jc w:val="left"/>
+            </w:pPr>
+            <w:r/>
+            <w:r>
+              <w:rPr>
+                <w:rFonts w:ascii="Calibri" w:hAnsi="Calibri"/>
+                <w:b w:val="0"/>
+                <w:sz w:val="18"/>
+              </w:rPr>
+              <w:t>ASTRO recurring</w:t>
+            </w:r>
+          </w:p>
+        </w:tc>
+        <w:tc>
+          <w:tcPr>
+            <w:tcW w:type="dxa" w:w="2340"/>
+            <w:shd w:fill="ECEFF1" w:val="clear"/>
+          </w:tcPr>
+          <w:p>
+            <w:pPr>
+              <w:spacing w:after="40"/>
+              <w:jc w:val="left"/>
+            </w:pPr>
+            <w:r/>
+            <w:r>
+              <w:rPr>
+                <w:rFonts w:ascii="Calibri" w:hAnsi="Calibri"/>
+                <w:b w:val="0"/>
+                <w:sz w:val="18"/>
+              </w:rPr>
+              <w:t>Automation exists; recurring execution not verified</w:t>
+            </w:r>
+          </w:p>
+        </w:tc>
+        <w:tc>
+          <w:tcPr>
+            <w:tcW w:type="dxa" w:w="2340"/>
+            <w:shd w:fill="ECEFF1" w:val="clear"/>
+          </w:tcPr>
+          <w:p>
+            <w:pPr>
+              <w:spacing w:after="40"/>
+              <w:jc w:val="left"/>
+            </w:pPr>
+            <w:r/>
+            <w:r>
+              <w:rPr>
+                <w:rFonts w:ascii="Calibri" w:hAnsi="Calibri"/>
+                <w:b w:val="0"/>
+                <w:sz w:val="18"/>
+              </w:rPr>
+              <w:t>Clarified</w:t>
+            </w:r>
+          </w:p>
+        </w:tc>
+      </w:tr>
+      <w:tr>
+        <w:tc>
+          <w:tcPr>
+            <w:tcW w:type="dxa" w:w="2340"/>
+          </w:tcPr>
+          <w:p>
+            <w:pPr>
+              <w:spacing w:after="40"/>
+              <w:jc w:val="left"/>
+            </w:pPr>
+            <w:r/>
+            <w:r>
+              <w:rPr>
+                <w:rFonts w:ascii="Calibri" w:hAnsi="Calibri"/>
+                <w:b w:val="0"/>
+                <w:sz w:val="18"/>
+              </w:rPr>
+              <w:t>C-09</w:t>
+            </w:r>
+          </w:p>
+        </w:tc>
+        <w:tc>
+          <w:tcPr>
+            <w:tcW w:type="dxa" w:w="2340"/>
+          </w:tcPr>
+          <w:p>
+            <w:pPr>
+              <w:spacing w:after="40"/>
+              <w:jc w:val="left"/>
+            </w:pPr>
+            <w:r/>
+            <w:r>
+              <w:rPr>
+                <w:rFonts w:ascii="Calibri" w:hAnsi="Calibri"/>
+                <w:b w:val="0"/>
+                <w:sz w:val="18"/>
+              </w:rPr>
+              <w:t>Backoffice vs nightly</w:t>
+            </w:r>
+          </w:p>
+        </w:tc>
+        <w:tc>
+          <w:tcPr>
+            <w:tcW w:type="dxa" w:w="2340"/>
+          </w:tcPr>
+          <w:p>
+            <w:pPr>
+              <w:spacing w:after="40"/>
+              <w:jc w:val="left"/>
+            </w:pPr>
+            <w:r/>
+            <w:r>
+              <w:rPr>
+                <w:rFonts w:ascii="Calibri" w:hAnsi="Calibri"/>
+                <w:b w:val="0"/>
+                <w:sz w:val="18"/>
+              </w:rPr>
+              <w:t>Large inventory; active nightly subset unverified</w:t>
+            </w:r>
+          </w:p>
+        </w:tc>
+        <w:tc>
+          <w:tcPr>
+            <w:tcW w:type="dxa" w:w="2340"/>
+          </w:tcPr>
+          <w:p>
+            <w:pPr>
+              <w:spacing w:after="40"/>
+              <w:jc w:val="left"/>
+            </w:pPr>
+            <w:r/>
+            <w:r>
+              <w:rPr>
+                <w:rFonts w:ascii="Calibri" w:hAnsi="Calibri"/>
+                <w:b w:val="0"/>
+                <w:sz w:val="18"/>
+              </w:rPr>
+              <w:t>Clarified</w:t>
+            </w:r>
+          </w:p>
+        </w:tc>
+      </w:tr>
+      <w:tr>
+        <w:tc>
+          <w:tcPr>
+            <w:tcW w:type="dxa" w:w="2340"/>
+            <w:shd w:fill="ECEFF1" w:val="clear"/>
+          </w:tcPr>
+          <w:p>
+            <w:pPr>
+              <w:spacing w:after="40"/>
+              <w:jc w:val="left"/>
+            </w:pPr>
+            <w:r/>
+            <w:r>
+              <w:rPr>
+                <w:rFonts w:ascii="Calibri" w:hAnsi="Calibri"/>
+                <w:b w:val="0"/>
+                <w:sz w:val="18"/>
+              </w:rPr>
+              <w:t>C-10</w:t>
+            </w:r>
+          </w:p>
+        </w:tc>
+        <w:tc>
+          <w:tcPr>
+            <w:tcW w:type="dxa" w:w="2340"/>
+            <w:shd w:fill="ECEFF1" w:val="clear"/>
+          </w:tcPr>
+          <w:p>
+            <w:pPr>
+              <w:spacing w:after="40"/>
+              <w:jc w:val="left"/>
+            </w:pPr>
+            <w:r/>
+            <w:r>
+              <w:rPr>
+                <w:rFonts w:ascii="Calibri" w:hAnsi="Calibri"/>
+                <w:b w:val="0"/>
+                <w:sz w:val="18"/>
+              </w:rPr>
+              <w:t>COPACS</w:t>
+            </w:r>
+          </w:p>
+        </w:tc>
+        <w:tc>
+          <w:tcPr>
+            <w:tcW w:type="dxa" w:w="2340"/>
+            <w:shd w:fill="ECEFF1" w:val="clear"/>
+          </w:tcPr>
+          <w:p>
+            <w:pPr>
+              <w:spacing w:after="40"/>
+              <w:jc w:val="left"/>
+            </w:pPr>
+            <w:r/>
+            <w:r>
+              <w:rPr>
+                <w:rFonts w:ascii="Calibri" w:hAnsi="Calibri"/>
+                <w:b w:val="0"/>
+                <w:sz w:val="18"/>
+              </w:rPr>
+              <w:t>COPACS - scope Unknown; no validated automation identified</w:t>
+            </w:r>
+          </w:p>
+        </w:tc>
+        <w:tc>
+          <w:tcPr>
+            <w:tcW w:type="dxa" w:w="2340"/>
+            <w:shd w:fill="ECEFF1" w:val="clear"/>
+          </w:tcPr>
+          <w:p>
+            <w:pPr>
+              <w:spacing w:after="40"/>
+              <w:jc w:val="left"/>
+            </w:pPr>
+            <w:r/>
+            <w:r>
+              <w:rPr>
+                <w:rFonts w:ascii="Calibri" w:hAnsi="Calibri"/>
+                <w:b w:val="0"/>
+                <w:sz w:val="18"/>
+              </w:rPr>
+              <w:t>Clarified</w:t>
+            </w:r>
+          </w:p>
+        </w:tc>
+      </w:tr>
+      <w:tr>
+        <w:tc>
+          <w:tcPr>
+            <w:tcW w:type="dxa" w:w="2340"/>
+          </w:tcPr>
+          <w:p>
+            <w:pPr>
+              <w:spacing w:after="40"/>
+              <w:jc w:val="left"/>
+            </w:pPr>
+            <w:r/>
+            <w:r>
+              <w:rPr>
+                <w:rFonts w:ascii="Calibri" w:hAnsi="Calibri"/>
+                <w:b w:val="0"/>
+                <w:sz w:val="18"/>
+              </w:rPr>
+              <w:t>C-11</w:t>
+            </w:r>
+          </w:p>
+        </w:tc>
+        <w:tc>
+          <w:tcPr>
+            <w:tcW w:type="dxa" w:w="2340"/>
+          </w:tcPr>
+          <w:p>
+            <w:pPr>
+              <w:spacing w:after="40"/>
+              <w:jc w:val="left"/>
+            </w:pPr>
+            <w:r/>
+            <w:r>
+              <w:rPr>
+                <w:rFonts w:ascii="Calibri" w:hAnsi="Calibri"/>
+                <w:b w:val="0"/>
+                <w:sz w:val="18"/>
+              </w:rPr>
+              <w:t>JaCoCo/Sonar</w:t>
+            </w:r>
+          </w:p>
+        </w:tc>
+        <w:tc>
+          <w:tcPr>
+            <w:tcW w:type="dxa" w:w="2340"/>
+          </w:tcPr>
+          <w:p>
+            <w:pPr>
+              <w:spacing w:after="40"/>
+              <w:jc w:val="left"/>
+            </w:pPr>
+            <w:r/>
+            <w:r>
+              <w:rPr>
+                <w:rFonts w:ascii="Calibri" w:hAnsi="Calibri"/>
+                <w:b w:val="0"/>
+                <w:sz w:val="18"/>
+              </w:rPr>
+              <w:t>Application source-code coverage: partial on services; not QA business metric; no Sonar gate</w:t>
+            </w:r>
+          </w:p>
+        </w:tc>
+        <w:tc>
+          <w:tcPr>
+            <w:tcW w:type="dxa" w:w="2340"/>
+          </w:tcPr>
+          <w:p>
+            <w:pPr>
+              <w:spacing w:after="40"/>
+              <w:jc w:val="left"/>
+            </w:pPr>
+            <w:r/>
+            <w:r>
+              <w:rPr>
+                <w:rFonts w:ascii="Calibri" w:hAnsi="Calibri"/>
+                <w:b w:val="0"/>
+                <w:sz w:val="18"/>
+              </w:rPr>
+              <w:t>Clarified</w:t>
             </w:r>
           </w:p>
         </w:tc>
@@ -372,51 +1767,12 @@
         <w:pStyle w:val="Heading1"/>
       </w:pPr>
       <w:r>
-        <w:t>Contradictions Resolved</w:t>
+        <w:t>Approved Leadership Narrative</w:t>
       </w:r>
     </w:p>
     <w:p>
       <w:r>
-        <w:t># Contradiction Resolution Ledger</w:t>
-        <w:br/>
-        <w:br/>
-        <w:t xml:space="preserve">**Re-audit date:** 2026-07-20 (rebuild for 2026-07-21 leadership review)  </w:t>
-        <w:br/>
-        <w:t>**Status key:** Verified · Pending verification · Corrected · Unknown</w:t>
-        <w:br/>
-        <w:br/>
-        <w:t>| ID | Topic | Old claim (prior assessment) | Evidence | Corrected claim | Status | Reason |</w:t>
-        <w:br/>
-        <w:t>|----|-------|------------------------------|----------|-----------------|--------|--------|</w:t>
-        <w:br/>
-        <w:t>| C-01 | Mobile 2 coverage | 24/24 = **100%** in-scope | Sign-off **22/25 = 88%** @ `7ccaf46` (2026-07-14); code @ `cee0de9` adds YTD + `GET mobilebanks/{id}` | **Verified: 22/25 (88.0%)** · **Pending sign-off: 24/25 (96.0%)** projected | **Corrected** | Removed denominator manipulation excluding `mobilemembers`; helper endpoint stays out of automation numerator per sign-off |</w:t>
-        <w:br/>
-        <w:t>| C-02 | Mobile 2 superseded | "88% superseded by code review" | Leadership baseline + sign-off path incomplete | **88% remains verified leadership baseline**; 96% is **pending** only | **Corrected** | Sign-off requires MR merge matrix refresh QC4/Stage1 rerun |</w:t>
-        <w:br/>
-        <w:t>| C-03 | Mobile 1 coverage | **6/27 = 22.2% verified** | Workbook lists 1 automated @ 2026-07-09; 5 new classes on `main` @ `cee0de9` without QC4/Stage1 evidence | **Verified: 1/27 (3.7%)** · **Implemented pending: 5 endpoints (potential 6/27)** | **Corrected** | Code ≠ verified sign-off metric |</w:t>
-        <w:br/>
-        <w:t>| C-04 | GitHub Actions | "Not implemented / not in repo" | `17-MOBILE2-NEXUS-GITHUB-ACTIONS-PIPELINE.md`; leadership pack Chaitanya validation | **Dashboard vertical slice externally validated**; module expansion in progress; workflow repo **not in audit clone** | **Corrected** | Separate from GitLab nightly regression |</w:t>
-        <w:br/>
-        <w:t>| C-05 | CI "hard gate" | V3/metadataweb labeled **hard gate** implying merge block | `.gitlab-ci.yml` uses `only: schedules`; fails job on test errors | **Scheduled regression — hard-fail on run**; **not verified MR/deployment gate** | **Corrected** | Scheduled failure ≠ merge gate |</w:t>
-        <w:br/>
-        <w:t>| C-06 | V2 recurring | Implied "verified recurring regression" | Jenkins job name/schedule not in repo; qTest PDF only | **Automation exists; recurring schedule Unknown** | **Corrected** | Ant targets documented; live Jenkins TBD |</w:t>
-        <w:br/>
-        <w:t>| C-07 | Metadata API scope | "~269 methods" mixed with UP headline | Only `scheduled_metadataweb_stage1` in GitLab CI | **Metadataweb module on schedule**; other universal modules manual only | **Clarified** | Scope conclusion to scheduled job only |</w:t>
-        <w:br/>
-        <w:t>| C-08 | ASTRO recurring | Listed with other GS areas without schedule proof | `ASTRO-TB-REFRESH` prep only; no nightly GitLab | **Automation exists; recurring execution not verified** | **Clarified** | No schedule evidence |</w:t>
-        <w:br/>
-        <w:t>| C-09 | Backoffice vs nightly | 1077 scenarios inventory | Not in V3 GitLab `scheduled_regression_job` | **Large inventory; active nightly subset unverified** | **Clarified** | Separate from V3 nightly population |</w:t>
-        <w:br/>
-        <w:t>| C-10 | COPACS | "COPACS" spelling inconsistent | No repo in reviewed set | **COPACS — scope Unknown; no validated automation identified** | **Clarified** | Requires platform owner |</w:t>
-        <w:br/>
-        <w:t>| C-11 | JaCoCo/Sonar | Mixed with QA coverage % | `RUN_SONARQUBE: false`; JaCoCo on UniteMSC POMs | **Application source-code coverage: partial on services; not QA business metric; no Sonar gate** | **Clarified** | Metric type separation |</w:t>
-        <w:br/>
-        <w:br/>
-        <w:t>## Leadership narrative (approved wording)</w:t>
-        <w:br/>
-        <w:br/>
         <w:t>The team has meaningful automation across Government Savings. The current limitation is not the ability to build automation; it is establishing a consistent, traceable coverage model across Jira, qTest, repositories, and CI execution. We can report verified platform-specific metrics now, but we should not publish one GS-wide percentage until the denominators and pipeline evidence are governed.</w:t>
-        <w:br/>
       </w:r>
     </w:p>
     <w:p>
@@ -477,14 +1833,221 @@
     </w:p>
     <w:p>
       <w:r>
-        <w:t>C:\Workspace\GitLab\qa-automation-kb\government-savings-automation-assessment</w:t>
+        <w:t>Primary assessment folder: government-savings-automation-assessment/ (verified-metrics-register.csv, business-coverage-register, contradiction-resolution-ledger.md, pipeline-job-inventory.csv, and linked repository evidence).</w:t>
       </w:r>
     </w:p>
+    <w:p>
+      <w:pPr>
+        <w:pStyle w:val="Heading1"/>
+      </w:pPr>
+      <w:r>
+        <w:t>Document Control</w:t>
+      </w:r>
+    </w:p>
+    <w:tbl>
+      <w:tblPr>
+        <w:tblStyle w:val="TableGrid"/>
+        <w:tblW w:type="auto" w:w="0"/>
+        <w:tblLayout w:type="autofit"/>
+        <w:tblLook w:firstColumn="1" w:firstRow="1" w:lastColumn="0" w:lastRow="0" w:noHBand="0" w:noVBand="1" w:val="04A0"/>
+      </w:tblPr>
+      <w:tblGrid>
+        <w:gridCol w:w="2340"/>
+        <w:gridCol w:w="2340"/>
+        <w:gridCol w:w="2340"/>
+        <w:gridCol w:w="2340"/>
+      </w:tblGrid>
+      <w:tr>
+        <w:tc>
+          <w:tcPr>
+            <w:tcW w:type="dxa" w:w="2340"/>
+            <w:shd w:fill="003057" w:val="clear"/>
+          </w:tcPr>
+          <w:p>
+            <w:pPr>
+              <w:jc w:val="left"/>
+            </w:pPr>
+            <w:r>
+              <w:rPr>
+                <w:color w:val="FFFFFF"/>
+              </w:rPr>
+            </w:r>
+            <w:r>
+              <w:rPr>
+                <w:rFonts w:ascii="Calibri" w:hAnsi="Calibri"/>
+                <w:b/>
+                <w:color w:val="FFFFFF"/>
+                <w:sz w:val="20"/>
+              </w:rPr>
+              <w:t>Version</w:t>
+            </w:r>
+          </w:p>
+        </w:tc>
+        <w:tc>
+          <w:tcPr>
+            <w:tcW w:type="dxa" w:w="2340"/>
+            <w:shd w:fill="003057" w:val="clear"/>
+          </w:tcPr>
+          <w:p>
+            <w:pPr>
+              <w:jc w:val="left"/>
+            </w:pPr>
+            <w:r>
+              <w:rPr>
+                <w:color w:val="FFFFFF"/>
+              </w:rPr>
+            </w:r>
+            <w:r>
+              <w:rPr>
+                <w:rFonts w:ascii="Calibri" w:hAnsi="Calibri"/>
+                <w:b/>
+                <w:color w:val="FFFFFF"/>
+                <w:sz w:val="20"/>
+              </w:rPr>
+              <w:t>Date</w:t>
+            </w:r>
+          </w:p>
+        </w:tc>
+        <w:tc>
+          <w:tcPr>
+            <w:tcW w:type="dxa" w:w="2340"/>
+            <w:shd w:fill="003057" w:val="clear"/>
+          </w:tcPr>
+          <w:p>
+            <w:pPr>
+              <w:jc w:val="left"/>
+            </w:pPr>
+            <w:r>
+              <w:rPr>
+                <w:color w:val="FFFFFF"/>
+              </w:rPr>
+            </w:r>
+            <w:r>
+              <w:rPr>
+                <w:rFonts w:ascii="Calibri" w:hAnsi="Calibri"/>
+                <w:b/>
+                <w:color w:val="FFFFFF"/>
+                <w:sz w:val="20"/>
+              </w:rPr>
+              <w:t>Author</w:t>
+            </w:r>
+          </w:p>
+        </w:tc>
+        <w:tc>
+          <w:tcPr>
+            <w:tcW w:type="dxa" w:w="2340"/>
+            <w:shd w:fill="003057" w:val="clear"/>
+          </w:tcPr>
+          <w:p>
+            <w:pPr>
+              <w:jc w:val="left"/>
+            </w:pPr>
+            <w:r>
+              <w:rPr>
+                <w:color w:val="FFFFFF"/>
+              </w:rPr>
+            </w:r>
+            <w:r>
+              <w:rPr>
+                <w:rFonts w:ascii="Calibri" w:hAnsi="Calibri"/>
+                <w:b/>
+                <w:color w:val="FFFFFF"/>
+                <w:sz w:val="20"/>
+              </w:rPr>
+              <w:t>Changes</w:t>
+            </w:r>
+          </w:p>
+        </w:tc>
+      </w:tr>
+      <w:tr>
+        <w:tc>
+          <w:tcPr>
+            <w:tcW w:type="dxa" w:w="2340"/>
+          </w:tcPr>
+          <w:p>
+            <w:pPr>
+              <w:spacing w:after="40"/>
+              <w:jc w:val="left"/>
+            </w:pPr>
+            <w:r/>
+            <w:r>
+              <w:rPr>
+                <w:rFonts w:ascii="Calibri" w:hAnsi="Calibri"/>
+                <w:b w:val="0"/>
+                <w:sz w:val="18"/>
+              </w:rPr>
+              <w:t>1.1</w:t>
+            </w:r>
+          </w:p>
+        </w:tc>
+        <w:tc>
+          <w:tcPr>
+            <w:tcW w:type="dxa" w:w="2340"/>
+          </w:tcPr>
+          <w:p>
+            <w:pPr>
+              <w:spacing w:after="40"/>
+              <w:jc w:val="left"/>
+            </w:pPr>
+            <w:r/>
+            <w:r>
+              <w:rPr>
+                <w:rFonts w:ascii="Calibri" w:hAnsi="Calibri"/>
+                <w:b w:val="0"/>
+                <w:sz w:val="18"/>
+              </w:rPr>
+              <w:t>July 21, 2026</w:t>
+            </w:r>
+          </w:p>
+        </w:tc>
+        <w:tc>
+          <w:tcPr>
+            <w:tcW w:type="dxa" w:w="2340"/>
+          </w:tcPr>
+          <w:p>
+            <w:pPr>
+              <w:spacing w:after="40"/>
+              <w:jc w:val="left"/>
+            </w:pPr>
+            <w:r/>
+            <w:r>
+              <w:rPr>
+                <w:rFonts w:ascii="Calibri" w:hAnsi="Calibri"/>
+                <w:b w:val="0"/>
+                <w:sz w:val="18"/>
+              </w:rPr>
+              <w:t>Swapnil Patil</w:t>
+            </w:r>
+          </w:p>
+        </w:tc>
+        <w:tc>
+          <w:tcPr>
+            <w:tcW w:type="dxa" w:w="2340"/>
+          </w:tcPr>
+          <w:p>
+            <w:pPr>
+              <w:spacing w:after="40"/>
+              <w:jc w:val="left"/>
+            </w:pPr>
+            <w:r/>
+            <w:r>
+              <w:rPr>
+                <w:rFonts w:ascii="Calibri" w:hAnsi="Calibri"/>
+                <w:b w:val="0"/>
+                <w:sz w:val="18"/>
+              </w:rPr>
+              <w:t>Formatting refresh; contradiction table; severity shading</w:t>
+            </w:r>
+          </w:p>
+        </w:tc>
+      </w:tr>
+    </w:tbl>
+    <w:p/>
     <w:sectPr>
       <w:headerReference w:type="default" r:id="rId9"/>
       <w:footerReference w:type="default" r:id="rId10"/>
       <w:pgSz w:w="12240" w:h="15840"/>
-      <w:pgMar w:top="1134" w:right="1800" w:bottom="1134" w:left="1800" w:header="720" w:footer="720" w:gutter="0"/>
+      <w:pgMar w:top="1440" w:right="1440" w:bottom="1440" w:left="1440" w:header="720" w:footer="720" w:gutter="0"/>
       <w:cols w:space="720"/>
       <w:docGrid w:linePitch="360"/>
     </w:sectPr>
@@ -501,9 +2064,10 @@
     </w:pPr>
     <w:r>
       <w:rPr>
+        <w:rFonts w:ascii="Calibri" w:hAnsi="Calibri"/>
         <w:sz w:val="18"/>
       </w:rPr>
-      <w:t xml:space="preserve">Confidential — Internal Use  |  July 21, 2026  |  Page </w:t>
+      <w:t xml:space="preserve">Confidential - Internal Use  |  July 21, 2026  |  Page </w:t>
     </w:r>
     <w:fldSimple w:instr="PAGE"/>
   </w:p>
@@ -518,6 +2082,7 @@
     </w:pPr>
     <w:r>
       <w:rPr>
+        <w:rFonts w:ascii="Calibri" w:hAnsi="Calibri"/>
         <w:color w:val="003057"/>
         <w:sz w:val="18"/>
       </w:rPr>
@@ -890,6 +2455,10 @@
     <w:name w:val="Normal"/>
     <w:qFormat/>
     <w:rsid w:val="00FC693F"/>
+    <w:rPr>
+      <w:rFonts w:ascii="Calibri" w:hAnsi="Calibri"/>
+      <w:sz w:val="22"/>
+    </w:rPr>
   </w:style>
   <w:style w:type="paragraph" w:styleId="Header">
     <w:name w:val="header"/>
@@ -950,10 +2519,10 @@
       <w:outlineLvl w:val="0"/>
     </w:pPr>
     <w:rPr>
-      <w:rFonts w:asciiTheme="majorHAnsi" w:eastAsiaTheme="majorEastAsia" w:hAnsiTheme="majorHAnsi" w:cstheme="majorBidi"/>
+      <w:rFonts w:asciiTheme="majorHAnsi" w:eastAsiaTheme="majorEastAsia" w:hAnsiTheme="majorHAnsi" w:cstheme="majorBidi" w:ascii="Calibri" w:hAnsi="Calibri"/>
       <w:b/>
       <w:bCs/>
-      <w:color w:val="365F91" w:themeColor="accent1" w:themeShade="BF"/>
+      <w:color w:val="003057"/>
       <w:sz w:val="28"/>
       <w:szCs w:val="28"/>
     </w:rPr>
@@ -974,10 +2543,10 @@
       <w:outlineLvl w:val="1"/>
     </w:pPr>
     <w:rPr>
-      <w:rFonts w:asciiTheme="majorHAnsi" w:eastAsiaTheme="majorEastAsia" w:hAnsiTheme="majorHAnsi" w:cstheme="majorBidi"/>
+      <w:rFonts w:asciiTheme="majorHAnsi" w:eastAsiaTheme="majorEastAsia" w:hAnsiTheme="majorHAnsi" w:cstheme="majorBidi" w:ascii="Calibri" w:hAnsi="Calibri"/>
       <w:b/>
       <w:bCs/>
-      <w:color w:val="4F81BD" w:themeColor="accent1"/>
+      <w:color w:val="003057"/>
       <w:sz w:val="26"/>
       <w:szCs w:val="26"/>
     </w:rPr>
@@ -998,10 +2567,10 @@
       <w:outlineLvl w:val="2"/>
     </w:pPr>
     <w:rPr>
-      <w:rFonts w:asciiTheme="majorHAnsi" w:eastAsiaTheme="majorEastAsia" w:hAnsiTheme="majorHAnsi" w:cstheme="majorBidi"/>
+      <w:rFonts w:asciiTheme="majorHAnsi" w:eastAsiaTheme="majorEastAsia" w:hAnsiTheme="majorHAnsi" w:cstheme="majorBidi" w:ascii="Calibri" w:hAnsi="Calibri"/>
       <w:b/>
       <w:bCs/>
-      <w:color w:val="4F81BD" w:themeColor="accent1"/>
+      <w:color w:val="003057"/>
     </w:rPr>
   </w:style>
   <w:style w:type="paragraph" w:styleId="Heading4">

</xml_diff>